<commit_message>
Replace test fixture with actual CBM-Master-PRD.docx v2.6
The fixture committed by Claude Code was v2.3 (pre-MST-SVC-NNN codes).
Replace with the canonical v2.6 from ClevelandBusinessMentoring repo
(commit 7ee9946). All 26 adapter tests pass against v2.6 including
the no-warnings regression guard.
</commit_message>
<xml_diff>
--- a/automation/tests/fixtures/cbm-master-prd-v2.6.docx
+++ b/automation/tests/fixtures/cbm-master-prd-v2.6.docx
@@ -138,7 +138,7 @@
                 <w:sz w:val="20"/>
                 <w:szCs w:val="20"/>
               </w:rPr>
-              <w:t xml:space="preserve">2.3</w:t>
+              <w:t>2.6</w:t>
             </w:r>
           </w:p>
         </w:tc>
@@ -256,7 +256,7 @@
                 <w:sz w:val="20"/>
                 <w:szCs w:val="20"/>
               </w:rPr>
-              <w:t xml:space="preserve">04-05-26 19:00</w:t>
+              <w:t>04-10-26 14:30</w:t>
             </w:r>
           </w:p>
         </w:tc>
@@ -12820,7 +12820,7 @@
         <w:pStyle w:val="Heading2"/>
       </w:pPr>
       <w:r>
-        <w:t xml:space="preserve">4.1 Notes Service</w:t>
+        <w:t>4.1 MST-SVC-001 — Notes Service (NOTES)</w:t>
       </w:r>
     </w:p>
     <w:p>
@@ -12971,7 +12971,7 @@
         <w:pStyle w:val="Heading2"/>
       </w:pPr>
       <w:r>
-        <w:t xml:space="preserve">4.2 Email Service</w:t>
+        <w:t>4.2 MST-SVC-002 — Email Service (EMAIL)</w:t>
       </w:r>
     </w:p>
     <w:p>
@@ -13122,7 +13122,7 @@
         <w:pStyle w:val="Heading2"/>
       </w:pPr>
       <w:r>
-        <w:t xml:space="preserve">4.3 Calendar Service</w:t>
+        <w:t>4.3 MST-SVC-003 — Calendar Service (CALENDAR)</w:t>
       </w:r>
     </w:p>
     <w:p>
@@ -13255,7 +13255,7 @@
         <w:pStyle w:val="Heading2"/>
       </w:pPr>
       <w:r>
-        <w:t xml:space="preserve">4.4 Survey Service</w:t>
+        <w:t>4.4 MST-SVC-004 — Survey Service (SURVEY)</w:t>
       </w:r>
     </w:p>
     <w:p>
@@ -14057,6 +14057,180 @@
           <w:szCs w:val="22"/>
         </w:rPr>
         <w:t xml:space="preserve">The CRM serves as the single source of truth for all contacts known to CBM. Contact lists are maintained in the CRM and synchronized to the outbound marketing system for campaign delivery. Campaign engagement history is recorded back into the CRM against each contact record, ensuring a complete picture of every interaction CBM has had with each individual regardless of channel.</w:t>
+      </w:r>
+    </w:p>
+    <w:p>
+      <w:pPr>
+        <w:pStyle w:val="Heading2"/>
+      </w:pPr>
+      <w:r>
+        <w:t xml:space="preserve">5.4 Universal Contact-Creation Rules</w:t>
+      </w:r>
+    </w:p>
+    <w:p>
+      <w:pPr>
+        <w:spacing w:after="120"/>
+      </w:pPr>
+      <w:r>
+        <w:rPr>
+          <w:rFonts w:ascii="Arial" w:cs="Arial" w:eastAsia="Arial" w:hAnsi="Arial"/>
+          <w:sz w:val="22"/>
+          <w:szCs w:val="22"/>
+        </w:rPr>
+        <w:t xml:space="preserve">The CRM applies a uniform set of rules to every Contact-creation pathway across all domains. These rules ensure consistency in how Contact records are created, how they are linked to Account records, and how their initial type and lifecycle state are established. The full specification is in the CR-MARKETING Sub-Domain Overview Section 4.4. The rules in summary are:</w:t>
+      </w:r>
+    </w:p>
+    <w:p>
+      <w:pPr>
+        <w:pStyle w:val="ListParagraph"/>
+        <w:numPr>
+          <w:ilvl w:val="0"/>
+          <w:numId w:val="2"/>
+        </w:numPr>
+        <w:spacing w:after="40"/>
+      </w:pPr>
+      <w:r>
+        <w:rPr>
+          <w:rFonts w:ascii="Arial" w:cs="Arial" w:eastAsia="Arial" w:hAnsi="Arial"/>
+          <w:b/>
+          <w:bCs/>
+          <w:sz w:val="22"/>
+          <w:szCs w:val="22"/>
+        </w:rPr>
+        <w:t xml:space="preserve">Optional company information on every form. </w:t>
+      </w:r>
+      <w:r>
+        <w:rPr>
+          <w:rFonts w:ascii="Arial" w:cs="Arial" w:eastAsia="Arial" w:hAnsi="Arial"/>
+          <w:sz w:val="22"/>
+          <w:szCs w:val="22"/>
+        </w:rPr>
+        <w:t xml:space="preserve">Every Contact-creation form (web inquiry, event registration, mentor application, partner contact intake, donor signup, etc.) presents two optional fields: company name and company website. The fields are always offered, never required.</w:t>
+      </w:r>
+    </w:p>
+    <w:p>
+      <w:pPr>
+        <w:pStyle w:val="ListParagraph"/>
+        <w:numPr>
+          <w:ilvl w:val="0"/>
+          <w:numId w:val="2"/>
+        </w:numPr>
+        <w:spacing w:after="40"/>
+      </w:pPr>
+      <w:r>
+        <w:rPr>
+          <w:rFonts w:ascii="Arial" w:cs="Arial" w:eastAsia="Arial" w:hAnsi="Arial"/>
+          <w:b/>
+          <w:bCs/>
+          <w:sz w:val="22"/>
+          <w:szCs w:val="22"/>
+        </w:rPr>
+        <w:t xml:space="preserve">Hardcoded contactType per form. </w:t>
+      </w:r>
+      <w:r>
+        <w:rPr>
+          <w:rFonts w:ascii="Arial" w:cs="Arial" w:eastAsia="Arial" w:hAnsi="Arial"/>
+          <w:sz w:val="22"/>
+          <w:szCs w:val="22"/>
+        </w:rPr>
+        <w:t xml:space="preserve">The contactType for Contacts created through a given form is determined by the form’s configuration, not by user selection. A mentor application form creates Mentor contacts; a client inquiry form creates Client contacts; a partner contact intake form creates Partner contacts.</w:t>
+      </w:r>
+    </w:p>
+    <w:p>
+      <w:pPr>
+        <w:pStyle w:val="ListParagraph"/>
+        <w:numPr>
+          <w:ilvl w:val="0"/>
+          <w:numId w:val="2"/>
+        </w:numPr>
+        <w:spacing w:after="40"/>
+      </w:pPr>
+      <w:r>
+        <w:rPr>
+          <w:rFonts w:ascii="Arial" w:cs="Arial" w:eastAsia="Arial" w:hAnsi="Arial"/>
+          <w:b/>
+          <w:bCs/>
+          <w:sz w:val="22"/>
+          <w:szCs w:val="22"/>
+        </w:rPr>
+        <w:t xml:space="preserve">CSV imports require explicit contactType assignment. </w:t>
+      </w:r>
+      <w:r>
+        <w:rPr>
+          <w:rFonts w:ascii="Arial" w:cs="Arial" w:eastAsia="Arial" w:hAnsi="Arial"/>
+          <w:sz w:val="22"/>
+          <w:szCs w:val="22"/>
+        </w:rPr>
+        <w:t xml:space="preserve">Bulk CSV imports either select a contactType for the entire import or read it from a per-row column.</w:t>
+      </w:r>
+    </w:p>
+    <w:p>
+      <w:pPr>
+        <w:pStyle w:val="ListParagraph"/>
+        <w:numPr>
+          <w:ilvl w:val="0"/>
+          <w:numId w:val="2"/>
+        </w:numPr>
+        <w:spacing w:after="40"/>
+      </w:pPr>
+      <w:r>
+        <w:rPr>
+          <w:rFonts w:ascii="Arial" w:cs="Arial" w:eastAsia="Arial" w:hAnsi="Arial"/>
+          <w:b/>
+          <w:bCs/>
+          <w:sz w:val="22"/>
+          <w:szCs w:val="22"/>
+        </w:rPr>
+        <w:t xml:space="preserve">contactType determines type-specific creation logic. </w:t>
+      </w:r>
+      <w:r>
+        <w:rPr>
+          <w:rFonts w:ascii="Arial" w:cs="Arial" w:eastAsia="Arial" w:hAnsi="Arial"/>
+          <w:sz w:val="22"/>
+          <w:szCs w:val="22"/>
+        </w:rPr>
+        <w:t xml:space="preserve">Once a Contact is created with a known contactType, type-specific business logic runs as appropriate (lifecycle field initialization, default values, type-specific workflow triggers).</w:t>
+      </w:r>
+    </w:p>
+    <w:p>
+      <w:pPr>
+        <w:pStyle w:val="ListParagraph"/>
+        <w:numPr>
+          <w:ilvl w:val="0"/>
+          <w:numId w:val="2"/>
+        </w:numPr>
+        <w:spacing w:after="40"/>
+      </w:pPr>
+      <w:r>
+        <w:rPr>
+          <w:rFonts w:ascii="Arial" w:cs="Arial" w:eastAsia="Arial" w:hAnsi="Arial"/>
+          <w:b/>
+          <w:bCs/>
+          <w:sz w:val="22"/>
+          <w:szCs w:val="22"/>
+        </w:rPr>
+        <w:t xml:space="preserve">Account matching is contactType-agnostic. </w:t>
+      </w:r>
+      <w:r>
+        <w:rPr>
+          <w:rFonts w:ascii="Arial" w:cs="Arial" w:eastAsia="Arial" w:hAnsi="Arial"/>
+          <w:sz w:val="22"/>
+          <w:szCs w:val="22"/>
+        </w:rPr>
+        <w:t xml:space="preserve">When company information is provided, the same Account precedence ladder runs (website match → manual or new) regardless of the Contact’s contactType. The native Account.website field is the basis for automatic matching, and is the only signal trusted for automatic linking — name-based linking is not performed because two unrelated firms can share a name.</w:t>
+      </w:r>
+    </w:p>
+    <w:p>
+      <w:pPr>
+        <w:spacing w:after="120"/>
+      </w:pPr>
+      <w:r>
+        <w:rPr>
+          <w:rFonts w:ascii="Arial" w:cs="Arial" w:eastAsia="Arial" w:hAnsi="Arial"/>
+          <w:sz w:val="22"/>
+          <w:szCs w:val="22"/>
+        </w:rPr>
+        <w:t xml:space="preserve">All domains and sub-domains that introduce Contact-creation pathways (CR, MN, MR, FU, plus any cross-domain services) must comply with these rules. The rules apply equally to web forms, CSV imports, single-record manual creation, and any other inbound creation channel.</w:t>
       </w:r>
     </w:p>
     <w:sectPr>

</xml_diff>